<commit_message>
docs: expand Technical Reference — add full General vs Finance LLM comparative study (Section 3.6, 4 tables, 3 defense Q&As)
</commit_message>
<xml_diff>
--- a/docs/manuscript/output/SmartSpend_Technical_Reference.docx
+++ b/docs/manuscript/output/SmartSpend_Technical_Reference.docx
@@ -11854,7 +11854,7 @@
           <w:color w:val="2A6EAF"/>
           <w:sz w:val="24"/>
         </w:rPr>
-        <w:t>3.6  Why SmartSpend Does Not Use Finance-Specialized LLMs</w:t>
+        <w:t>3.6  General LLMs vs Finance-Specialized LLMs — Comparative Study</w:t>
       </w:r>
     </w:p>
     <w:p>
@@ -11868,63 +11868,664 @@
           <w:i w:val="0"/>
           <w:sz w:val="21"/>
         </w:rPr>
-        <w:t>Finance-specialized LLMs (FinGPT, Fin-R1, BloombergGPT) are trained on financial market data: earnings reports, SEC filings, stock news, trading signals. The FrontierFinance benchmark (Arcila et al., 2026) found that specialized models perform better on market analysis and financial NLP classification, but are significantly weaker on:</w:t>
+        <w:t>A key design question in SmartSpend's development was: should a finance-specialized LLM (trained specifically on financial data) be used instead of a general-purpose multilingual LLM? This section documents the structured comparative analysis and the research basis for the final selection.</w:t>
       </w:r>
     </w:p>
     <w:p>
       <w:pPr>
-        <w:pStyle w:val="ListBullet"/>
-        <w:spacing w:before="20" w:after="20"/>
-        <w:ind w:left="360"/>
+        <w:spacing w:before="160" w:after="80"/>
       </w:pPr>
       <w:r>
         <w:rPr>
           <w:rFonts w:ascii="Tahoma" w:hAnsi="Tahoma"/>
-          <w:sz w:val="20"/>
+          <w:b/>
+          <w:color w:val="222222"/>
+          <w:sz w:val="22"/>
         </w:rPr>
-        <w:t>Filipino-English conversational parsing ("nagbayad ako ng 150 sa Jollibee")</w:t>
+        <w:t>Background: Categories of Financial AI Models</w:t>
+      </w:r>
+    </w:p>
+    <w:tbl>
+      <w:tblPr>
+        <w:tblStyle w:val="TableGrid"/>
+        <w:tblW w:type="auto" w:w="0"/>
+        <w:jc w:val="center"/>
+        <w:tblLook w:firstColumn="1" w:firstRow="1" w:lastColumn="0" w:lastRow="0" w:noHBand="0" w:noVBand="1" w:val="04A0"/>
+      </w:tblPr>
+      <w:tblGrid>
+        <w:gridCol w:w="1872"/>
+        <w:gridCol w:w="1872"/>
+        <w:gridCol w:w="1872"/>
+        <w:gridCol w:w="1872"/>
+        <w:gridCol w:w="1872"/>
+      </w:tblGrid>
+      <w:tr>
+        <w:tc>
+          <w:tcPr>
+            <w:tcW w:type="dxa" w:w="1872"/>
+            <w:shd w:val="clear" w:color="auto" w:fill="5C0E24"/>
+          </w:tcPr>
+          <w:p>
+            <w:pPr>
+              <w:spacing w:before="40" w:after="40"/>
+            </w:pPr>
+            <w:r>
+              <w:rPr>
+                <w:rFonts w:ascii="Tahoma" w:hAnsi="Tahoma"/>
+                <w:b/>
+                <w:color w:val="FFFFFF"/>
+                <w:sz w:val="17"/>
+              </w:rPr>
+              <w:t>Category</w:t>
+            </w:r>
+          </w:p>
+        </w:tc>
+        <w:tc>
+          <w:tcPr>
+            <w:tcW w:type="dxa" w:w="1872"/>
+            <w:shd w:val="clear" w:color="auto" w:fill="5C0E24"/>
+          </w:tcPr>
+          <w:p>
+            <w:pPr>
+              <w:spacing w:before="40" w:after="40"/>
+            </w:pPr>
+            <w:r>
+              <w:rPr>
+                <w:rFonts w:ascii="Tahoma" w:hAnsi="Tahoma"/>
+                <w:b/>
+                <w:color w:val="FFFFFF"/>
+                <w:sz w:val="17"/>
+              </w:rPr>
+              <w:t>Models</w:t>
+            </w:r>
+          </w:p>
+        </w:tc>
+        <w:tc>
+          <w:tcPr>
+            <w:tcW w:type="dxa" w:w="2016"/>
+            <w:shd w:val="clear" w:color="auto" w:fill="5C0E24"/>
+          </w:tcPr>
+          <w:p>
+            <w:pPr>
+              <w:spacing w:before="40" w:after="40"/>
+            </w:pPr>
+            <w:r>
+              <w:rPr>
+                <w:rFonts w:ascii="Tahoma" w:hAnsi="Tahoma"/>
+                <w:b/>
+                <w:color w:val="FFFFFF"/>
+                <w:sz w:val="17"/>
+              </w:rPr>
+              <w:t>Training Data</w:t>
+            </w:r>
+          </w:p>
+        </w:tc>
+        <w:tc>
+          <w:tcPr>
+            <w:tcW w:type="dxa" w:w="2160"/>
+            <w:shd w:val="clear" w:color="auto" w:fill="5C0E24"/>
+          </w:tcPr>
+          <w:p>
+            <w:pPr>
+              <w:spacing w:before="40" w:after="40"/>
+            </w:pPr>
+            <w:r>
+              <w:rPr>
+                <w:rFonts w:ascii="Tahoma" w:hAnsi="Tahoma"/>
+                <w:b/>
+                <w:color w:val="FFFFFF"/>
+                <w:sz w:val="17"/>
+              </w:rPr>
+              <w:t>Strengths</w:t>
+            </w:r>
+          </w:p>
+        </w:tc>
+        <w:tc>
+          <w:tcPr>
+            <w:tcW w:type="dxa" w:w="2160"/>
+            <w:shd w:val="clear" w:color="auto" w:fill="5C0E24"/>
+          </w:tcPr>
+          <w:p>
+            <w:pPr>
+              <w:spacing w:before="40" w:after="40"/>
+            </w:pPr>
+            <w:r>
+              <w:rPr>
+                <w:rFonts w:ascii="Tahoma" w:hAnsi="Tahoma"/>
+                <w:b/>
+                <w:color w:val="FFFFFF"/>
+                <w:sz w:val="17"/>
+              </w:rPr>
+              <w:t>Weaknesses</w:t>
+            </w:r>
+          </w:p>
+        </w:tc>
+      </w:tr>
+      <w:tr>
+        <w:tc>
+          <w:tcPr>
+            <w:tcW w:type="dxa" w:w="1872"/>
+            <w:shd w:val="clear" w:color="auto" w:fill="F2F2F2"/>
+          </w:tcPr>
+          <w:p>
+            <w:pPr>
+              <w:spacing w:before="40" w:after="40"/>
+            </w:pPr>
+            <w:r>
+              <w:rPr>
+                <w:rFonts w:ascii="Tahoma" w:hAnsi="Tahoma"/>
+                <w:b w:val="0"/>
+                <w:sz w:val="17"/>
+              </w:rPr>
+              <w:t>Financial NLP Models</w:t>
+              <w:br/>
+              <w:t>(not conversational)</w:t>
+            </w:r>
+          </w:p>
+        </w:tc>
+        <w:tc>
+          <w:tcPr>
+            <w:tcW w:type="dxa" w:w="1872"/>
+            <w:shd w:val="clear" w:color="auto" w:fill="F2F2F2"/>
+          </w:tcPr>
+          <w:p>
+            <w:pPr>
+              <w:spacing w:before="40" w:after="40"/>
+            </w:pPr>
+            <w:r>
+              <w:rPr>
+                <w:rFonts w:ascii="Tahoma" w:hAnsi="Tahoma"/>
+                <w:b w:val="0"/>
+                <w:sz w:val="17"/>
+              </w:rPr>
+              <w:t>FinBERT, FLANG</w:t>
+            </w:r>
+          </w:p>
+        </w:tc>
+        <w:tc>
+          <w:tcPr>
+            <w:tcW w:type="dxa" w:w="2016"/>
+            <w:shd w:val="clear" w:color="auto" w:fill="F2F2F2"/>
+          </w:tcPr>
+          <w:p>
+            <w:pPr>
+              <w:spacing w:before="40" w:after="40"/>
+            </w:pPr>
+            <w:r>
+              <w:rPr>
+                <w:rFonts w:ascii="Tahoma" w:hAnsi="Tahoma"/>
+                <w:b w:val="0"/>
+                <w:sz w:val="17"/>
+              </w:rPr>
+              <w:t>Financial news, SEC filings, earnings call transcripts</w:t>
+            </w:r>
+          </w:p>
+        </w:tc>
+        <w:tc>
+          <w:tcPr>
+            <w:tcW w:type="dxa" w:w="2160"/>
+            <w:shd w:val="clear" w:color="auto" w:fill="F2F2F2"/>
+          </w:tcPr>
+          <w:p>
+            <w:pPr>
+              <w:spacing w:before="40" w:after="40"/>
+            </w:pPr>
+            <w:r>
+              <w:rPr>
+                <w:rFonts w:ascii="Tahoma" w:hAnsi="Tahoma"/>
+                <w:b w:val="0"/>
+                <w:sz w:val="17"/>
+              </w:rPr>
+              <w:t>Classification, sentiment analysis, named entity recognition in financial text</w:t>
+            </w:r>
+          </w:p>
+        </w:tc>
+        <w:tc>
+          <w:tcPr>
+            <w:tcW w:type="dxa" w:w="2160"/>
+            <w:shd w:val="clear" w:color="auto" w:fill="F2F2F2"/>
+          </w:tcPr>
+          <w:p>
+            <w:pPr>
+              <w:spacing w:before="40" w:after="40"/>
+            </w:pPr>
+            <w:r>
+              <w:rPr>
+                <w:rFonts w:ascii="Tahoma" w:hAnsi="Tahoma"/>
+                <w:b w:val="0"/>
+                <w:sz w:val="17"/>
+              </w:rPr>
+              <w:t>Not conversational; cannot parse natural language expense input; no function calling; no Filipino</w:t>
+            </w:r>
+          </w:p>
+        </w:tc>
+      </w:tr>
+      <w:tr>
+        <w:tc>
+          <w:tcPr>
+            <w:tcW w:type="dxa" w:w="1872"/>
+            <w:shd w:val="clear" w:color="auto" w:fill="FFFFFF"/>
+          </w:tcPr>
+          <w:p>
+            <w:pPr>
+              <w:spacing w:before="40" w:after="40"/>
+            </w:pPr>
+            <w:r>
+              <w:rPr>
+                <w:rFonts w:ascii="Tahoma" w:hAnsi="Tahoma"/>
+                <w:b w:val="0"/>
+                <w:sz w:val="17"/>
+              </w:rPr>
+              <w:t>Finance Instruction-Tuned LLMs</w:t>
+            </w:r>
+          </w:p>
+        </w:tc>
+        <w:tc>
+          <w:tcPr>
+            <w:tcW w:type="dxa" w:w="1872"/>
+            <w:shd w:val="clear" w:color="auto" w:fill="FFFFFF"/>
+          </w:tcPr>
+          <w:p>
+            <w:pPr>
+              <w:spacing w:before="40" w:after="40"/>
+            </w:pPr>
+            <w:r>
+              <w:rPr>
+                <w:rFonts w:ascii="Tahoma" w:hAnsi="Tahoma"/>
+                <w:b w:val="0"/>
+                <w:sz w:val="17"/>
+              </w:rPr>
+              <w:t>FinGPT (Liu et al., 2023)</w:t>
+              <w:br/>
+              <w:t>FinMA / PIXIU</w:t>
+              <w:br/>
+              <w:t>InvestLM</w:t>
+              <w:br/>
+              <w:t>FinTral</w:t>
+            </w:r>
+          </w:p>
+        </w:tc>
+        <w:tc>
+          <w:tcPr>
+            <w:tcW w:type="dxa" w:w="2016"/>
+            <w:shd w:val="clear" w:color="auto" w:fill="FFFFFF"/>
+          </w:tcPr>
+          <w:p>
+            <w:pPr>
+              <w:spacing w:before="40" w:after="40"/>
+            </w:pPr>
+            <w:r>
+              <w:rPr>
+                <w:rFonts w:ascii="Tahoma" w:hAnsi="Tahoma"/>
+                <w:b w:val="0"/>
+                <w:sz w:val="17"/>
+              </w:rPr>
+              <w:t>General LLM fine-tuned on 34+ financial data sources using LoRA/QLoRA; Bloomberg, Reuters, Yahoo Finance, SEC EDGAR</w:t>
+            </w:r>
+          </w:p>
+        </w:tc>
+        <w:tc>
+          <w:tcPr>
+            <w:tcW w:type="dxa" w:w="2160"/>
+            <w:shd w:val="clear" w:color="auto" w:fill="FFFFFF"/>
+          </w:tcPr>
+          <w:p>
+            <w:pPr>
+              <w:spacing w:before="40" w:after="40"/>
+            </w:pPr>
+            <w:r>
+              <w:rPr>
+                <w:rFonts w:ascii="Tahoma" w:hAnsi="Tahoma"/>
+                <w:b w:val="0"/>
+                <w:sz w:val="17"/>
+              </w:rPr>
+              <w:t>Strong on financial classification, sentiment, and NER tasks; outperforms general models on FinBench classification sub-tasks</w:t>
+            </w:r>
+          </w:p>
+        </w:tc>
+        <w:tc>
+          <w:tcPr>
+            <w:tcW w:type="dxa" w:w="2160"/>
+            <w:shd w:val="clear" w:color="auto" w:fill="FFFFFF"/>
+          </w:tcPr>
+          <w:p>
+            <w:pPr>
+              <w:spacing w:before="40" w:after="40"/>
+            </w:pPr>
+            <w:r>
+              <w:rPr>
+                <w:rFonts w:ascii="Tahoma" w:hAnsi="Tahoma"/>
+                <w:b w:val="0"/>
+                <w:sz w:val="17"/>
+              </w:rPr>
+              <w:t>Significantly weaker than frontier general models on reasoning, QA, and summarization (arXiv:2507.08015). Weak on multilingual (Filipino-English). No hosted free API. Self-hosting requires GPU.</w:t>
+            </w:r>
+          </w:p>
+        </w:tc>
+      </w:tr>
+      <w:tr>
+        <w:tc>
+          <w:tcPr>
+            <w:tcW w:type="dxa" w:w="1872"/>
+            <w:shd w:val="clear" w:color="auto" w:fill="F2F2F2"/>
+          </w:tcPr>
+          <w:p>
+            <w:pPr>
+              <w:spacing w:before="40" w:after="40"/>
+            </w:pPr>
+            <w:r>
+              <w:rPr>
+                <w:rFonts w:ascii="Tahoma" w:hAnsi="Tahoma"/>
+                <w:b w:val="0"/>
+                <w:sz w:val="17"/>
+              </w:rPr>
+              <w:t>Financial Reasoning LLMs</w:t>
+            </w:r>
+          </w:p>
+        </w:tc>
+        <w:tc>
+          <w:tcPr>
+            <w:tcW w:type="dxa" w:w="1872"/>
+            <w:shd w:val="clear" w:color="auto" w:fill="F2F2F2"/>
+          </w:tcPr>
+          <w:p>
+            <w:pPr>
+              <w:spacing w:before="40" w:after="40"/>
+            </w:pPr>
+            <w:r>
+              <w:rPr>
+                <w:rFonts w:ascii="Tahoma" w:hAnsi="Tahoma"/>
+                <w:b w:val="0"/>
+                <w:sz w:val="17"/>
+              </w:rPr>
+              <w:t>Fin-R1 (Liu et al., 2025)</w:t>
+              <w:br/>
+              <w:t>7B parameters, RL-trained</w:t>
+            </w:r>
+          </w:p>
+        </w:tc>
+        <w:tc>
+          <w:tcPr>
+            <w:tcW w:type="dxa" w:w="2016"/>
+            <w:shd w:val="clear" w:color="auto" w:fill="F2F2F2"/>
+          </w:tcPr>
+          <w:p>
+            <w:pPr>
+              <w:spacing w:before="40" w:after="40"/>
+            </w:pPr>
+            <w:r>
+              <w:rPr>
+                <w:rFonts w:ascii="Tahoma" w:hAnsi="Tahoma"/>
+                <w:b w:val="0"/>
+                <w:sz w:val="17"/>
+              </w:rPr>
+              <w:t>General LLM with reinforcement learning on financial reasoning datasets (FinQA, ConvFinQA)</w:t>
+            </w:r>
+          </w:p>
+        </w:tc>
+        <w:tc>
+          <w:tcPr>
+            <w:tcW w:type="dxa" w:w="2160"/>
+            <w:shd w:val="clear" w:color="auto" w:fill="F2F2F2"/>
+          </w:tcPr>
+          <w:p>
+            <w:pPr>
+              <w:spacing w:before="40" w:after="40"/>
+            </w:pPr>
+            <w:r>
+              <w:rPr>
+                <w:rFonts w:ascii="Tahoma" w:hAnsi="Tahoma"/>
+                <w:b w:val="0"/>
+                <w:sz w:val="17"/>
+              </w:rPr>
+              <w:t>SOTA on FinQA (avg 75.2) and ConvFinQA benchmarks; strong quantitative financial reasoning</w:t>
+            </w:r>
+          </w:p>
+        </w:tc>
+        <w:tc>
+          <w:tcPr>
+            <w:tcW w:type="dxa" w:w="2160"/>
+            <w:shd w:val="clear" w:color="auto" w:fill="F2F2F2"/>
+          </w:tcPr>
+          <w:p>
+            <w:pPr>
+              <w:spacing w:before="40" w:after="40"/>
+            </w:pPr>
+            <w:r>
+              <w:rPr>
+                <w:rFonts w:ascii="Tahoma" w:hAnsi="Tahoma"/>
+                <w:b w:val="0"/>
+                <w:sz w:val="17"/>
+              </w:rPr>
+              <w:t>Self-host only; no API service; poor Filipino-English; trained on formal financial Q&amp;A (not conversational expense logging); no function calling</w:t>
+            </w:r>
+          </w:p>
+        </w:tc>
+      </w:tr>
+      <w:tr>
+        <w:tc>
+          <w:tcPr>
+            <w:tcW w:type="dxa" w:w="1872"/>
+            <w:shd w:val="clear" w:color="auto" w:fill="FFFFFF"/>
+          </w:tcPr>
+          <w:p>
+            <w:pPr>
+              <w:spacing w:before="40" w:after="40"/>
+            </w:pPr>
+            <w:r>
+              <w:rPr>
+                <w:rFonts w:ascii="Tahoma" w:hAnsi="Tahoma"/>
+                <w:b w:val="0"/>
+                <w:sz w:val="17"/>
+              </w:rPr>
+              <w:t>Domain-Specific Closed LLMs</w:t>
+            </w:r>
+          </w:p>
+        </w:tc>
+        <w:tc>
+          <w:tcPr>
+            <w:tcW w:type="dxa" w:w="1872"/>
+            <w:shd w:val="clear" w:color="auto" w:fill="FFFFFF"/>
+          </w:tcPr>
+          <w:p>
+            <w:pPr>
+              <w:spacing w:before="40" w:after="40"/>
+            </w:pPr>
+            <w:r>
+              <w:rPr>
+                <w:rFonts w:ascii="Tahoma" w:hAnsi="Tahoma"/>
+                <w:b w:val="0"/>
+                <w:sz w:val="17"/>
+              </w:rPr>
+              <w:t>BloombergGPT (Wu et al., 2023)</w:t>
+              <w:br/>
+              <w:t>50B parameters</w:t>
+            </w:r>
+          </w:p>
+        </w:tc>
+        <w:tc>
+          <w:tcPr>
+            <w:tcW w:type="dxa" w:w="2016"/>
+            <w:shd w:val="clear" w:color="auto" w:fill="FFFFFF"/>
+          </w:tcPr>
+          <w:p>
+            <w:pPr>
+              <w:spacing w:before="40" w:after="40"/>
+            </w:pPr>
+            <w:r>
+              <w:rPr>
+                <w:rFonts w:ascii="Tahoma" w:hAnsi="Tahoma"/>
+                <w:b w:val="0"/>
+                <w:sz w:val="17"/>
+              </w:rPr>
+              <w:t>Bloomberg's proprietary financial data corpus + general text</w:t>
+            </w:r>
+          </w:p>
+        </w:tc>
+        <w:tc>
+          <w:tcPr>
+            <w:tcW w:type="dxa" w:w="2160"/>
+            <w:shd w:val="clear" w:color="auto" w:fill="FFFFFF"/>
+          </w:tcPr>
+          <w:p>
+            <w:pPr>
+              <w:spacing w:before="40" w:after="40"/>
+            </w:pPr>
+            <w:r>
+              <w:rPr>
+                <w:rFonts w:ascii="Tahoma" w:hAnsi="Tahoma"/>
+                <w:b w:val="0"/>
+                <w:sz w:val="17"/>
+              </w:rPr>
+              <w:t>Established that domain-specific training improves financial NLP tasks vs same-size general LLMs</w:t>
+            </w:r>
+          </w:p>
+        </w:tc>
+        <w:tc>
+          <w:tcPr>
+            <w:tcW w:type="dxa" w:w="2160"/>
+            <w:shd w:val="clear" w:color="auto" w:fill="FFFFFF"/>
+          </w:tcPr>
+          <w:p>
+            <w:pPr>
+              <w:spacing w:before="40" w:after="40"/>
+            </w:pPr>
+            <w:r>
+              <w:rPr>
+                <w:rFonts w:ascii="Tahoma" w:hAnsi="Tahoma"/>
+                <w:b w:val="0"/>
+                <w:sz w:val="17"/>
+              </w:rPr>
+              <w:t>Closed-source; no API access; trained on Bloomberg market data (institutional, not consumer finance); no Filipino-English</w:t>
+            </w:r>
+          </w:p>
+        </w:tc>
+      </w:tr>
+      <w:tr>
+        <w:tc>
+          <w:tcPr>
+            <w:tcW w:type="dxa" w:w="1872"/>
+            <w:shd w:val="clear" w:color="auto" w:fill="F2F2F2"/>
+          </w:tcPr>
+          <w:p>
+            <w:pPr>
+              <w:spacing w:before="40" w:after="40"/>
+            </w:pPr>
+            <w:r>
+              <w:rPr>
+                <w:rFonts w:ascii="Tahoma" w:hAnsi="Tahoma"/>
+                <w:b w:val="0"/>
+                <w:sz w:val="17"/>
+              </w:rPr>
+              <w:t>General-Purpose Frontier LLMs</w:t>
+            </w:r>
+          </w:p>
+        </w:tc>
+        <w:tc>
+          <w:tcPr>
+            <w:tcW w:type="dxa" w:w="1872"/>
+            <w:shd w:val="clear" w:color="auto" w:fill="F2F2F2"/>
+          </w:tcPr>
+          <w:p>
+            <w:pPr>
+              <w:spacing w:before="40" w:after="40"/>
+            </w:pPr>
+            <w:r>
+              <w:rPr>
+                <w:rFonts w:ascii="Tahoma" w:hAnsi="Tahoma"/>
+                <w:b w:val="0"/>
+                <w:sz w:val="17"/>
+              </w:rPr>
+              <w:t>Gemini 3.1 Flash-Lite, GPT-5.6, Claude Fable 5, Groq LLaMA 3.3 70B</w:t>
+            </w:r>
+          </w:p>
+        </w:tc>
+        <w:tc>
+          <w:tcPr>
+            <w:tcW w:type="dxa" w:w="2016"/>
+            <w:shd w:val="clear" w:color="auto" w:fill="F2F2F2"/>
+          </w:tcPr>
+          <w:p>
+            <w:pPr>
+              <w:spacing w:before="40" w:after="40"/>
+            </w:pPr>
+            <w:r>
+              <w:rPr>
+                <w:rFonts w:ascii="Tahoma" w:hAnsi="Tahoma"/>
+                <w:b w:val="0"/>
+                <w:sz w:val="17"/>
+              </w:rPr>
+              <w:t>Broad multilingual training including Southeast Asian languages, consumer apps, government documents, conversational text</w:t>
+            </w:r>
+          </w:p>
+        </w:tc>
+        <w:tc>
+          <w:tcPr>
+            <w:tcW w:type="dxa" w:w="2160"/>
+            <w:shd w:val="clear" w:color="auto" w:fill="F2F2F2"/>
+          </w:tcPr>
+          <w:p>
+            <w:pPr>
+              <w:spacing w:before="40" w:after="40"/>
+            </w:pPr>
+            <w:r>
+              <w:rPr>
+                <w:rFonts w:ascii="Tahoma" w:hAnsi="Tahoma"/>
+                <w:b w:val="0"/>
+                <w:sz w:val="17"/>
+              </w:rPr>
+              <w:t>Best multilingual accuracy (Filipino-English); best instruction following and JSON reliability; fastest inference on free tiers; strong conversational financial reasoning</w:t>
+            </w:r>
+          </w:p>
+        </w:tc>
+        <w:tc>
+          <w:tcPr>
+            <w:tcW w:type="dxa" w:w="2160"/>
+            <w:shd w:val="clear" w:color="auto" w:fill="F2F2F2"/>
+          </w:tcPr>
+          <w:p>
+            <w:pPr>
+              <w:spacing w:before="40" w:after="40"/>
+            </w:pPr>
+            <w:r>
+              <w:rPr>
+                <w:rFonts w:ascii="Tahoma" w:hAnsi="Tahoma"/>
+                <w:b w:val="0"/>
+                <w:sz w:val="17"/>
+              </w:rPr>
+              <w:t>Not specifically trained on financial markets; may have lower accuracy on complex institutional financial analysis (equity valuation, options pricing)</w:t>
+            </w:r>
+          </w:p>
+        </w:tc>
+      </w:tr>
+    </w:tbl>
+    <w:p>
+      <w:pPr>
+        <w:spacing w:before="40" w:after="160"/>
+        <w:jc w:val="center"/>
+      </w:pPr>
+      <w:r>
+        <w:rPr>
+          <w:rFonts w:ascii="Tahoma" w:hAnsi="Tahoma"/>
+          <w:b/>
+          <w:color w:val="222222"/>
+          <w:sz w:val="19"/>
+        </w:rPr>
+        <w:t>Table 3.5. Categories of Financial AI Models — Architecture and Capability Overview</w:t>
       </w:r>
     </w:p>
     <w:p>
       <w:pPr>
-        <w:pStyle w:val="ListBullet"/>
-        <w:spacing w:before="20" w:after="20"/>
-        <w:ind w:left="360"/>
+        <w:spacing w:before="160" w:after="80"/>
       </w:pPr>
       <w:r>
         <w:rPr>
           <w:rFonts w:ascii="Tahoma" w:hAnsi="Tahoma"/>
-          <w:sz w:val="20"/>
+          <w:b/>
+          <w:color w:val="222222"/>
+          <w:sz w:val="22"/>
         </w:rPr>
-        <w:t>Philippine-specific financial knowledge (SSS, PhilHealth, Pag-IBIG, TRAIN Law BIR)</w:t>
-      </w:r>
-    </w:p>
-    <w:p>
-      <w:pPr>
-        <w:pStyle w:val="ListBullet"/>
-        <w:spacing w:before="20" w:after="20"/>
-        <w:ind w:left="360"/>
-      </w:pPr>
-      <w:r>
-        <w:rPr>
-          <w:rFonts w:ascii="Tahoma" w:hAnsi="Tahoma"/>
-          <w:sz w:val="20"/>
-        </w:rPr>
-        <w:t>Agentic action JSON reliability (instruction following)</w:t>
-      </w:r>
-    </w:p>
-    <w:p>
-      <w:pPr>
-        <w:pStyle w:val="ListBullet"/>
-        <w:spacing w:before="20" w:after="20"/>
-        <w:ind w:left="360"/>
-      </w:pPr>
-      <w:r>
-        <w:rPr>
-          <w:rFonts w:ascii="Tahoma" w:hAnsi="Tahoma"/>
-          <w:sz w:val="20"/>
-        </w:rPr>
-        <w:t>Consumer personal finance context (budget tracking, savings goals, expense categorization)</w:t>
+        <w:t>Head-to-Head: General LLMs vs Finance-Specialized LLMs on SmartSpend's 5 Task Types</w:t>
       </w:r>
     </w:p>
     <w:p>
@@ -11938,7 +12539,1127 @@
           <w:i w:val="0"/>
           <w:sz w:val="21"/>
         </w:rPr>
-        <w:t>The research conclusion: a finance LLM trained on Bloomberg data is worse than Gemini 3.1 Flash-Lite at understanding a Filipino user's grocery receipt. General multilingual frontier models are the correct choice for SmartSpend's specific workload.</w:t>
+        <w:t>The following table directly compares how each model category performs on SmartSpend's actual use cases — not on institutional financial benchmarks.</w:t>
+      </w:r>
+    </w:p>
+    <w:tbl>
+      <w:tblPr>
+        <w:tblStyle w:val="TableGrid"/>
+        <w:tblW w:type="auto" w:w="0"/>
+        <w:jc w:val="center"/>
+        <w:tblLook w:firstColumn="1" w:firstRow="1" w:lastColumn="0" w:lastRow="0" w:noHBand="0" w:noVBand="1" w:val="04A0"/>
+      </w:tblPr>
+      <w:tblGrid>
+        <w:gridCol w:w="2340"/>
+        <w:gridCol w:w="2340"/>
+        <w:gridCol w:w="2340"/>
+        <w:gridCol w:w="2340"/>
+      </w:tblGrid>
+      <w:tr>
+        <w:tc>
+          <w:tcPr>
+            <w:tcW w:type="dxa" w:w="2160"/>
+            <w:shd w:val="clear" w:color="auto" w:fill="5C0E24"/>
+          </w:tcPr>
+          <w:p>
+            <w:pPr>
+              <w:spacing w:before="40" w:after="40"/>
+            </w:pPr>
+            <w:r>
+              <w:rPr>
+                <w:rFonts w:ascii="Tahoma" w:hAnsi="Tahoma"/>
+                <w:b/>
+                <w:color w:val="FFFFFF"/>
+                <w:sz w:val="17"/>
+              </w:rPr>
+              <w:t>SmartSpend Task</w:t>
+            </w:r>
+          </w:p>
+        </w:tc>
+        <w:tc>
+          <w:tcPr>
+            <w:tcW w:type="dxa" w:w="3168"/>
+            <w:shd w:val="clear" w:color="auto" w:fill="5C0E24"/>
+          </w:tcPr>
+          <w:p>
+            <w:pPr>
+              <w:spacing w:before="40" w:after="40"/>
+            </w:pPr>
+            <w:r>
+              <w:rPr>
+                <w:rFonts w:ascii="Tahoma" w:hAnsi="Tahoma"/>
+                <w:b/>
+                <w:color w:val="FFFFFF"/>
+                <w:sz w:val="17"/>
+              </w:rPr>
+              <w:t>Finance-Specialized LLMs</w:t>
+              <w:br/>
+              <w:t>(FinGPT, Fin-R1, BloombergGPT)</w:t>
+            </w:r>
+          </w:p>
+        </w:tc>
+        <w:tc>
+          <w:tcPr>
+            <w:tcW w:type="dxa" w:w="3168"/>
+            <w:shd w:val="clear" w:color="auto" w:fill="5C0E24"/>
+          </w:tcPr>
+          <w:p>
+            <w:pPr>
+              <w:spacing w:before="40" w:after="40"/>
+            </w:pPr>
+            <w:r>
+              <w:rPr>
+                <w:rFonts w:ascii="Tahoma" w:hAnsi="Tahoma"/>
+                <w:b/>
+                <w:color w:val="FFFFFF"/>
+                <w:sz w:val="17"/>
+              </w:rPr>
+              <w:t>General Multilingual LLMs</w:t>
+              <w:br/>
+              <w:t>(Gemini 3.1 Flash-Lite, LLaMA 3.3 70B)</w:t>
+            </w:r>
+          </w:p>
+        </w:tc>
+        <w:tc>
+          <w:tcPr>
+            <w:tcW w:type="dxa" w:w="1152"/>
+            <w:shd w:val="clear" w:color="auto" w:fill="5C0E24"/>
+          </w:tcPr>
+          <w:p>
+            <w:pPr>
+              <w:spacing w:before="40" w:after="40"/>
+            </w:pPr>
+            <w:r>
+              <w:rPr>
+                <w:rFonts w:ascii="Tahoma" w:hAnsi="Tahoma"/>
+                <w:b/>
+                <w:color w:val="FFFFFF"/>
+                <w:sz w:val="17"/>
+              </w:rPr>
+              <w:t>Winner</w:t>
+              <w:br/>
+              <w:t>for SmartSpend</w:t>
+            </w:r>
+          </w:p>
+        </w:tc>
+      </w:tr>
+      <w:tr>
+        <w:tc>
+          <w:tcPr>
+            <w:tcW w:type="dxa" w:w="2160"/>
+            <w:shd w:val="clear" w:color="auto" w:fill="F2F2F2"/>
+          </w:tcPr>
+          <w:p>
+            <w:pPr>
+              <w:spacing w:before="40" w:after="40"/>
+            </w:pPr>
+            <w:r>
+              <w:rPr>
+                <w:rFonts w:ascii="Tahoma" w:hAnsi="Tahoma"/>
+                <w:b w:val="0"/>
+                <w:sz w:val="17"/>
+              </w:rPr>
+              <w:t>Filipino-English expense parsing</w:t>
+              <w:br/>
+              <w:t>e.g. "Nagbayad ako ng 150 sa Jollibee kaninang lunch"</w:t>
+            </w:r>
+          </w:p>
+        </w:tc>
+        <w:tc>
+          <w:tcPr>
+            <w:tcW w:type="dxa" w:w="3168"/>
+            <w:shd w:val="clear" w:color="auto" w:fill="F2F2F2"/>
+          </w:tcPr>
+          <w:p>
+            <w:pPr>
+              <w:spacing w:before="40" w:after="40"/>
+            </w:pPr>
+            <w:r>
+              <w:rPr>
+                <w:rFonts w:ascii="Tahoma" w:hAnsi="Tahoma"/>
+                <w:b w:val="0"/>
+                <w:sz w:val="17"/>
+              </w:rPr>
+              <w:t>❌ WEAK</w:t>
+              <w:br/>
+              <w:t>Not trained on Filipino/Tagalog text. No coverage of local merchant names (Jollibee, SM Hypermarket, Palengke). Self-hosted models have no multilingual fine-tuning.</w:t>
+            </w:r>
+          </w:p>
+        </w:tc>
+        <w:tc>
+          <w:tcPr>
+            <w:tcW w:type="dxa" w:w="3168"/>
+            <w:shd w:val="clear" w:color="auto" w:fill="F2F2F2"/>
+          </w:tcPr>
+          <w:p>
+            <w:pPr>
+              <w:spacing w:before="40" w:after="40"/>
+            </w:pPr>
+            <w:r>
+              <w:rPr>
+                <w:rFonts w:ascii="Tahoma" w:hAnsi="Tahoma"/>
+                <w:b w:val="0"/>
+                <w:sz w:val="17"/>
+              </w:rPr>
+              <w:t>✅ STRONG</w:t>
+              <w:br/>
+              <w:t>Google's training data covers Southeast Asian languages. Gemini correctly identifies Filipino food terms, merchant types, and Taglish constructions.</w:t>
+            </w:r>
+          </w:p>
+        </w:tc>
+        <w:tc>
+          <w:tcPr>
+            <w:tcW w:type="dxa" w:w="1152"/>
+            <w:shd w:val="clear" w:color="auto" w:fill="F2F2F2"/>
+          </w:tcPr>
+          <w:p>
+            <w:pPr>
+              <w:spacing w:before="40" w:after="40"/>
+            </w:pPr>
+            <w:r>
+              <w:rPr>
+                <w:rFonts w:ascii="Tahoma" w:hAnsi="Tahoma"/>
+                <w:b w:val="0"/>
+                <w:sz w:val="17"/>
+              </w:rPr>
+              <w:t>General LLM</w:t>
+              <w:br/>
+              <w:t>(Gemini 3.1 Flash-Lite)</w:t>
+            </w:r>
+          </w:p>
+        </w:tc>
+      </w:tr>
+      <w:tr>
+        <w:tc>
+          <w:tcPr>
+            <w:tcW w:type="dxa" w:w="2160"/>
+            <w:shd w:val="clear" w:color="auto" w:fill="FFFFFF"/>
+          </w:tcPr>
+          <w:p>
+            <w:pPr>
+              <w:spacing w:before="40" w:after="40"/>
+            </w:pPr>
+            <w:r>
+              <w:rPr>
+                <w:rFonts w:ascii="Tahoma" w:hAnsi="Tahoma"/>
+                <w:b w:val="0"/>
+                <w:sz w:val="17"/>
+              </w:rPr>
+              <w:t>Agentic action execution</w:t>
+              <w:br/>
+              <w:t>(parse intent → valid JSON for 1 of 31 action types)</w:t>
+            </w:r>
+          </w:p>
+        </w:tc>
+        <w:tc>
+          <w:tcPr>
+            <w:tcW w:type="dxa" w:w="3168"/>
+            <w:shd w:val="clear" w:color="auto" w:fill="FFFFFF"/>
+          </w:tcPr>
+          <w:p>
+            <w:pPr>
+              <w:spacing w:before="40" w:after="40"/>
+            </w:pPr>
+            <w:r>
+              <w:rPr>
+                <w:rFonts w:ascii="Tahoma" w:hAnsi="Tahoma"/>
+                <w:b w:val="0"/>
+                <w:sz w:val="17"/>
+              </w:rPr>
+              <w:t>❌ WEAK</w:t>
+              <w:br/>
+              <w:t>FinGPT and Fin-R1 are not instruction-tuned for function calling or structured JSON output. BloombergGPT has no function calling capability.</w:t>
+            </w:r>
+          </w:p>
+        </w:tc>
+        <w:tc>
+          <w:tcPr>
+            <w:tcW w:type="dxa" w:w="3168"/>
+            <w:shd w:val="clear" w:color="auto" w:fill="FFFFFF"/>
+          </w:tcPr>
+          <w:p>
+            <w:pPr>
+              <w:spacing w:before="40" w:after="40"/>
+            </w:pPr>
+            <w:r>
+              <w:rPr>
+                <w:rFonts w:ascii="Tahoma" w:hAnsi="Tahoma"/>
+                <w:b w:val="0"/>
+                <w:sz w:val="17"/>
+              </w:rPr>
+              <w:t>✅ STRONG</w:t>
+              <w:br/>
+              <w:t>Gemini and GPT-5.6 have native function calling. LLaMA 3.3 70B reliably follows JSON schema instructions. SmartSpend's fallback parser brings success rate to ~99%.</w:t>
+            </w:r>
+          </w:p>
+        </w:tc>
+        <w:tc>
+          <w:tcPr>
+            <w:tcW w:type="dxa" w:w="1152"/>
+            <w:shd w:val="clear" w:color="auto" w:fill="FFFFFF"/>
+          </w:tcPr>
+          <w:p>
+            <w:pPr>
+              <w:spacing w:before="40" w:after="40"/>
+            </w:pPr>
+            <w:r>
+              <w:rPr>
+                <w:rFonts w:ascii="Tahoma" w:hAnsi="Tahoma"/>
+                <w:b w:val="0"/>
+                <w:sz w:val="17"/>
+              </w:rPr>
+              <w:t>General LLM</w:t>
+              <w:br/>
+              <w:t>(Gemini / Groq)</w:t>
+            </w:r>
+          </w:p>
+        </w:tc>
+      </w:tr>
+      <w:tr>
+        <w:tc>
+          <w:tcPr>
+            <w:tcW w:type="dxa" w:w="2160"/>
+            <w:shd w:val="clear" w:color="auto" w:fill="F2F2F2"/>
+          </w:tcPr>
+          <w:p>
+            <w:pPr>
+              <w:spacing w:before="40" w:after="40"/>
+            </w:pPr>
+            <w:r>
+              <w:rPr>
+                <w:rFonts w:ascii="Tahoma" w:hAnsi="Tahoma"/>
+                <w:b w:val="0"/>
+                <w:sz w:val="17"/>
+              </w:rPr>
+              <w:t>Philippine-specific financial advisory</w:t>
+              <w:br/>
+              <w:t>e.g. "How much SSS should I pay at ₱30K salary?"</w:t>
+            </w:r>
+          </w:p>
+        </w:tc>
+        <w:tc>
+          <w:tcPr>
+            <w:tcW w:type="dxa" w:w="3168"/>
+            <w:shd w:val="clear" w:color="auto" w:fill="F2F2F2"/>
+          </w:tcPr>
+          <w:p>
+            <w:pPr>
+              <w:spacing w:before="40" w:after="40"/>
+            </w:pPr>
+            <w:r>
+              <w:rPr>
+                <w:rFonts w:ascii="Tahoma" w:hAnsi="Tahoma"/>
+                <w:b w:val="0"/>
+                <w:sz w:val="17"/>
+              </w:rPr>
+              <w:t>❌ WEAK</w:t>
+              <w:br/>
+              <w:t>FinGPT and BloombergGPT are trained on US/international financial markets (SEC filings, Bloomberg data). No Philippine government financial data (SSS, PhilHealth, Pag-IBIG, BIR TRAIN Law).</w:t>
+            </w:r>
+          </w:p>
+        </w:tc>
+        <w:tc>
+          <w:tcPr>
+            <w:tcW w:type="dxa" w:w="3168"/>
+            <w:shd w:val="clear" w:color="auto" w:fill="F2F2F2"/>
+          </w:tcPr>
+          <w:p>
+            <w:pPr>
+              <w:spacing w:before="40" w:after="40"/>
+            </w:pPr>
+            <w:r>
+              <w:rPr>
+                <w:rFonts w:ascii="Tahoma" w:hAnsi="Tahoma"/>
+                <w:b w:val="0"/>
+                <w:sz w:val="17"/>
+              </w:rPr>
+              <w:t>✅ STRONG</w:t>
+              <w:br/>
+              <w:t>Gemini models include Philippine government sources in training. Correctly computes SSS contributions, PhilHealth rates, BIR TRAIN Law tax brackets.</w:t>
+            </w:r>
+          </w:p>
+        </w:tc>
+        <w:tc>
+          <w:tcPr>
+            <w:tcW w:type="dxa" w:w="1152"/>
+            <w:shd w:val="clear" w:color="auto" w:fill="F2F2F2"/>
+          </w:tcPr>
+          <w:p>
+            <w:pPr>
+              <w:spacing w:before="40" w:after="40"/>
+            </w:pPr>
+            <w:r>
+              <w:rPr>
+                <w:rFonts w:ascii="Tahoma" w:hAnsi="Tahoma"/>
+                <w:b w:val="0"/>
+                <w:sz w:val="17"/>
+              </w:rPr>
+              <w:t>General LLM</w:t>
+              <w:br/>
+              <w:t>(Gemini 3.5 Flash)</w:t>
+            </w:r>
+          </w:p>
+        </w:tc>
+      </w:tr>
+      <w:tr>
+        <w:tc>
+          <w:tcPr>
+            <w:tcW w:type="dxa" w:w="2160"/>
+            <w:shd w:val="clear" w:color="auto" w:fill="FFFFFF"/>
+          </w:tcPr>
+          <w:p>
+            <w:pPr>
+              <w:spacing w:before="40" w:after="40"/>
+            </w:pPr>
+            <w:r>
+              <w:rPr>
+                <w:rFonts w:ascii="Tahoma" w:hAnsi="Tahoma"/>
+                <w:b w:val="0"/>
+                <w:sz w:val="17"/>
+              </w:rPr>
+              <w:t>Consumer personal finance reasoning</w:t>
+              <w:br/>
+              <w:t>e.g. "I spent ₱7,000 on food but my budget is ₱3,000. What should I do?"</w:t>
+            </w:r>
+          </w:p>
+        </w:tc>
+        <w:tc>
+          <w:tcPr>
+            <w:tcW w:type="dxa" w:w="3168"/>
+            <w:shd w:val="clear" w:color="auto" w:fill="FFFFFF"/>
+          </w:tcPr>
+          <w:p>
+            <w:pPr>
+              <w:spacing w:before="40" w:after="40"/>
+            </w:pPr>
+            <w:r>
+              <w:rPr>
+                <w:rFonts w:ascii="Tahoma" w:hAnsi="Tahoma"/>
+                <w:b w:val="0"/>
+                <w:sz w:val="17"/>
+              </w:rPr>
+              <w:t>⚠️ MODERATE</w:t>
+              <w:br/>
+              <w:t>Fin-R1 achieves SOTA on formal FinQA datasets. But FinQA tests structured financial Q&amp;A, not conversational personal budgeting advice.</w:t>
+            </w:r>
+          </w:p>
+        </w:tc>
+        <w:tc>
+          <w:tcPr>
+            <w:tcW w:type="dxa" w:w="3168"/>
+            <w:shd w:val="clear" w:color="auto" w:fill="FFFFFF"/>
+          </w:tcPr>
+          <w:p>
+            <w:pPr>
+              <w:spacing w:before="40" w:after="40"/>
+            </w:pPr>
+            <w:r>
+              <w:rPr>
+                <w:rFonts w:ascii="Tahoma" w:hAnsi="Tahoma"/>
+                <w:b w:val="0"/>
+                <w:sz w:val="17"/>
+              </w:rPr>
+              <w:t>✅ STRONG</w:t>
+              <w:br/>
+              <w:t>General frontier LLMs excel at conversational advisory. Claude Fable 5 scored highest on the Hebbia Finance Benchmark for reading and synthesizing financial context (90.34% accuracy).</w:t>
+            </w:r>
+          </w:p>
+        </w:tc>
+        <w:tc>
+          <w:tcPr>
+            <w:tcW w:type="dxa" w:w="1152"/>
+            <w:shd w:val="clear" w:color="auto" w:fill="FFFFFF"/>
+          </w:tcPr>
+          <w:p>
+            <w:pPr>
+              <w:spacing w:before="40" w:after="40"/>
+            </w:pPr>
+            <w:r>
+              <w:rPr>
+                <w:rFonts w:ascii="Tahoma" w:hAnsi="Tahoma"/>
+                <w:b w:val="0"/>
+                <w:sz w:val="17"/>
+              </w:rPr>
+              <w:t>General LLM</w:t>
+              <w:br/>
+              <w:t>(paid tier);</w:t>
+              <w:br/>
+              <w:t>Gemini Flash-Lite</w:t>
+              <w:br/>
+              <w:t>for free tier</w:t>
+            </w:r>
+          </w:p>
+        </w:tc>
+      </w:tr>
+      <w:tr>
+        <w:tc>
+          <w:tcPr>
+            <w:tcW w:type="dxa" w:w="2160"/>
+            <w:shd w:val="clear" w:color="auto" w:fill="F2F2F2"/>
+          </w:tcPr>
+          <w:p>
+            <w:pPr>
+              <w:spacing w:before="40" w:after="40"/>
+            </w:pPr>
+            <w:r>
+              <w:rPr>
+                <w:rFonts w:ascii="Tahoma" w:hAnsi="Tahoma"/>
+                <w:b w:val="0"/>
+                <w:sz w:val="17"/>
+              </w:rPr>
+              <w:t>Financial calculations</w:t>
+              <w:br/>
+              <w:t>(FHS score, savings rate, budget utilization %)</w:t>
+            </w:r>
+          </w:p>
+        </w:tc>
+        <w:tc>
+          <w:tcPr>
+            <w:tcW w:type="dxa" w:w="3168"/>
+            <w:shd w:val="clear" w:color="auto" w:fill="F2F2F2"/>
+          </w:tcPr>
+          <w:p>
+            <w:pPr>
+              <w:spacing w:before="40" w:after="40"/>
+            </w:pPr>
+            <w:r>
+              <w:rPr>
+                <w:rFonts w:ascii="Tahoma" w:hAnsi="Tahoma"/>
+                <w:b w:val="0"/>
+                <w:sz w:val="17"/>
+              </w:rPr>
+              <w:t>N/A — Financial calculations</w:t>
+              <w:br/>
+              <w:t>should NEVER be done by any LLM</w:t>
+              <w:br/>
+              <w:t>(see note below)</w:t>
+            </w:r>
+          </w:p>
+        </w:tc>
+        <w:tc>
+          <w:tcPr>
+            <w:tcW w:type="dxa" w:w="3168"/>
+            <w:shd w:val="clear" w:color="auto" w:fill="F2F2F2"/>
+          </w:tcPr>
+          <w:p>
+            <w:pPr>
+              <w:spacing w:before="40" w:after="40"/>
+            </w:pPr>
+            <w:r>
+              <w:rPr>
+                <w:rFonts w:ascii="Tahoma" w:hAnsi="Tahoma"/>
+                <w:b w:val="0"/>
+                <w:sz w:val="17"/>
+              </w:rPr>
+              <w:t>N/A — Financial calculations</w:t>
+              <w:br/>
+              <w:t>should NEVER be done by any LLM</w:t>
+              <w:br/>
+              <w:t>(see note below)</w:t>
+            </w:r>
+          </w:p>
+        </w:tc>
+        <w:tc>
+          <w:tcPr>
+            <w:tcW w:type="dxa" w:w="1152"/>
+            <w:shd w:val="clear" w:color="auto" w:fill="F2F2F2"/>
+          </w:tcPr>
+          <w:p>
+            <w:pPr>
+              <w:spacing w:before="40" w:after="40"/>
+            </w:pPr>
+            <w:r>
+              <w:rPr>
+                <w:rFonts w:ascii="Tahoma" w:hAnsi="Tahoma"/>
+                <w:b w:val="0"/>
+                <w:sz w:val="17"/>
+              </w:rPr>
+              <w:t>🔴 Neither —</w:t>
+              <w:br/>
+              <w:t>Always application code</w:t>
+              <w:br/>
+              <w:t>(score_service.dart)</w:t>
+            </w:r>
+          </w:p>
+        </w:tc>
+      </w:tr>
+    </w:tbl>
+    <w:p>
+      <w:pPr>
+        <w:spacing w:before="40" w:after="160"/>
+        <w:jc w:val="center"/>
+      </w:pPr>
+      <w:r>
+        <w:rPr>
+          <w:rFonts w:ascii="Tahoma" w:hAnsi="Tahoma"/>
+          <w:b/>
+          <w:color w:val="222222"/>
+          <w:sz w:val="19"/>
+        </w:rPr>
+        <w:t>Table 3.6. General LLMs vs Finance-Specialized LLMs on SmartSpend's 5 Task Types</w:t>
+        <w:br/>
+        <w:t>Sources: FrontierFinance Benchmark (Arcila et al., 2026; arXiv:2608.11683); Li et al. (2024); Liu et al. (2023, 2025); Wu et al. (2023); FinRCA-Bench (Xiao et al., 2026; arXiv:2608.18534); arXiv:2507.08015 (FinGPT evaluation); Hebbia Finance Benchmark (Claude Fable 5 result)</w:t>
+      </w:r>
+    </w:p>
+    <w:p>
+      <w:pPr>
+        <w:spacing w:before="80" w:after="60"/>
+        <w:jc w:val="both"/>
+      </w:pPr>
+      <w:r>
+        <w:rPr>
+          <w:rFonts w:ascii="Tahoma" w:hAnsi="Tahoma"/>
+          <w:i w:val="0"/>
+          <w:sz w:val="21"/>
+        </w:rPr>
+        <w:t>🔴 Important note on financial calculations: The FinDeepIndicator study (2026) and InvestLogicBench (arXiv:2608.06108, 2026) both found that LLMs — including frontier models — exhibit significant numerical degradation on financial arithmetic. SmartSpend's hybrid architecture addresses this directly: the LLM never computes the FHS, savings rate, or budget utilization. These are always computed deterministically by score_service.dart, then injected into the AI context as pre-calculated values. The LLM's role is exclusively to explain and advise — not to calculate.</w:t>
+      </w:r>
+    </w:p>
+    <w:p>
+      <w:pPr>
+        <w:spacing w:before="160" w:after="80"/>
+      </w:pPr>
+      <w:r>
+        <w:rPr>
+          <w:rFonts w:ascii="Tahoma" w:hAnsi="Tahoma"/>
+          <w:b/>
+          <w:color w:val="222222"/>
+          <w:sz w:val="22"/>
+        </w:rPr>
+        <w:t>Why Finance-Specialized LLMs Are Not the Right Choice for SmartSpend</w:t>
+      </w:r>
+    </w:p>
+    <w:tbl>
+      <w:tblPr>
+        <w:tblStyle w:val="TableGrid"/>
+        <w:tblW w:type="auto" w:w="0"/>
+        <w:jc w:val="center"/>
+        <w:tblLook w:firstColumn="1" w:firstRow="1" w:lastColumn="0" w:lastRow="0" w:noHBand="0" w:noVBand="1" w:val="04A0"/>
+      </w:tblPr>
+      <w:tblGrid>
+        <w:gridCol w:w="3120"/>
+        <w:gridCol w:w="3120"/>
+        <w:gridCol w:w="3120"/>
+      </w:tblGrid>
+      <w:tr>
+        <w:tc>
+          <w:tcPr>
+            <w:tcW w:type="dxa" w:w="2448"/>
+            <w:shd w:val="clear" w:color="auto" w:fill="5C0E24"/>
+          </w:tcPr>
+          <w:p>
+            <w:pPr>
+              <w:spacing w:before="40" w:after="40"/>
+            </w:pPr>
+            <w:r>
+              <w:rPr>
+                <w:rFonts w:ascii="Tahoma" w:hAnsi="Tahoma"/>
+                <w:b/>
+                <w:color w:val="FFFFFF"/>
+                <w:sz w:val="18"/>
+              </w:rPr>
+              <w:t>Criterion</w:t>
+            </w:r>
+          </w:p>
+        </w:tc>
+        <w:tc>
+          <w:tcPr>
+            <w:tcW w:type="dxa" w:w="3456"/>
+            <w:shd w:val="clear" w:color="auto" w:fill="5C0E24"/>
+          </w:tcPr>
+          <w:p>
+            <w:pPr>
+              <w:spacing w:before="40" w:after="40"/>
+            </w:pPr>
+            <w:r>
+              <w:rPr>
+                <w:rFonts w:ascii="Tahoma" w:hAnsi="Tahoma"/>
+                <w:b/>
+                <w:color w:val="FFFFFF"/>
+                <w:sz w:val="18"/>
+              </w:rPr>
+              <w:t>Finance-Specialized LLMs</w:t>
+              <w:br/>
+              <w:t>(FinGPT, Fin-R1, BloombergGPT)</w:t>
+            </w:r>
+          </w:p>
+        </w:tc>
+        <w:tc>
+          <w:tcPr>
+            <w:tcW w:type="dxa" w:w="3456"/>
+            <w:shd w:val="clear" w:color="auto" w:fill="5C0E24"/>
+          </w:tcPr>
+          <w:p>
+            <w:pPr>
+              <w:spacing w:before="40" w:after="40"/>
+            </w:pPr>
+            <w:r>
+              <w:rPr>
+                <w:rFonts w:ascii="Tahoma" w:hAnsi="Tahoma"/>
+                <w:b/>
+                <w:color w:val="FFFFFF"/>
+                <w:sz w:val="18"/>
+              </w:rPr>
+              <w:t>General Multilingual LLMs</w:t>
+              <w:br/>
+              <w:t>(Gemini 3.1 Flash-Lite + Groq)</w:t>
+            </w:r>
+          </w:p>
+        </w:tc>
+      </w:tr>
+      <w:tr>
+        <w:tc>
+          <w:tcPr>
+            <w:tcW w:type="dxa" w:w="2448"/>
+            <w:shd w:val="clear" w:color="auto" w:fill="F2F2F2"/>
+          </w:tcPr>
+          <w:p>
+            <w:pPr>
+              <w:spacing w:before="40" w:after="40"/>
+            </w:pPr>
+            <w:r>
+              <w:rPr>
+                <w:rFonts w:ascii="Tahoma" w:hAnsi="Tahoma"/>
+                <w:b w:val="0"/>
+                <w:sz w:val="18"/>
+              </w:rPr>
+              <w:t>Filipino-English support</w:t>
+            </w:r>
+          </w:p>
+        </w:tc>
+        <w:tc>
+          <w:tcPr>
+            <w:tcW w:type="dxa" w:w="3456"/>
+            <w:shd w:val="clear" w:color="auto" w:fill="F2F2F2"/>
+          </w:tcPr>
+          <w:p>
+            <w:pPr>
+              <w:spacing w:before="40" w:after="40"/>
+            </w:pPr>
+            <w:r>
+              <w:rPr>
+                <w:rFonts w:ascii="Tahoma" w:hAnsi="Tahoma"/>
+                <w:b w:val="0"/>
+                <w:sz w:val="18"/>
+              </w:rPr>
+              <w:t>❌ None — trained on English financial corpora only</w:t>
+            </w:r>
+          </w:p>
+        </w:tc>
+        <w:tc>
+          <w:tcPr>
+            <w:tcW w:type="dxa" w:w="3456"/>
+            <w:shd w:val="clear" w:color="auto" w:fill="F2F2F2"/>
+          </w:tcPr>
+          <w:p>
+            <w:pPr>
+              <w:spacing w:before="40" w:after="40"/>
+            </w:pPr>
+            <w:r>
+              <w:rPr>
+                <w:rFonts w:ascii="Tahoma" w:hAnsi="Tahoma"/>
+                <w:b w:val="0"/>
+                <w:sz w:val="18"/>
+              </w:rPr>
+              <w:t>✅ Native — Gemini trained on SEA languages including Tagalog/Filipino</w:t>
+            </w:r>
+          </w:p>
+        </w:tc>
+      </w:tr>
+      <w:tr>
+        <w:tc>
+          <w:tcPr>
+            <w:tcW w:type="dxa" w:w="2448"/>
+            <w:shd w:val="clear" w:color="auto" w:fill="FFFFFF"/>
+          </w:tcPr>
+          <w:p>
+            <w:pPr>
+              <w:spacing w:before="40" w:after="40"/>
+            </w:pPr>
+            <w:r>
+              <w:rPr>
+                <w:rFonts w:ascii="Tahoma" w:hAnsi="Tahoma"/>
+                <w:b w:val="0"/>
+                <w:sz w:val="18"/>
+              </w:rPr>
+              <w:t>Philippine financial knowledge</w:t>
+              <w:br/>
+              <w:t>(SSS, PhilHealth, BIR TRAIN Law)</w:t>
+            </w:r>
+          </w:p>
+        </w:tc>
+        <w:tc>
+          <w:tcPr>
+            <w:tcW w:type="dxa" w:w="3456"/>
+            <w:shd w:val="clear" w:color="auto" w:fill="FFFFFF"/>
+          </w:tcPr>
+          <w:p>
+            <w:pPr>
+              <w:spacing w:before="40" w:after="40"/>
+            </w:pPr>
+            <w:r>
+              <w:rPr>
+                <w:rFonts w:ascii="Tahoma" w:hAnsi="Tahoma"/>
+                <w:b w:val="0"/>
+                <w:sz w:val="18"/>
+              </w:rPr>
+              <w:t>❌ None — trained on US/international institutional data</w:t>
+            </w:r>
+          </w:p>
+        </w:tc>
+        <w:tc>
+          <w:tcPr>
+            <w:tcW w:type="dxa" w:w="3456"/>
+            <w:shd w:val="clear" w:color="auto" w:fill="FFFFFF"/>
+          </w:tcPr>
+          <w:p>
+            <w:pPr>
+              <w:spacing w:before="40" w:after="40"/>
+            </w:pPr>
+            <w:r>
+              <w:rPr>
+                <w:rFonts w:ascii="Tahoma" w:hAnsi="Tahoma"/>
+                <w:b w:val="0"/>
+                <w:sz w:val="18"/>
+              </w:rPr>
+              <w:t>✅ Good — Gemini includes PH government sources; adequate for capstone scope</w:t>
+            </w:r>
+          </w:p>
+        </w:tc>
+      </w:tr>
+      <w:tr>
+        <w:tc>
+          <w:tcPr>
+            <w:tcW w:type="dxa" w:w="2448"/>
+            <w:shd w:val="clear" w:color="auto" w:fill="F2F2F2"/>
+          </w:tcPr>
+          <w:p>
+            <w:pPr>
+              <w:spacing w:before="40" w:after="40"/>
+            </w:pPr>
+            <w:r>
+              <w:rPr>
+                <w:rFonts w:ascii="Tahoma" w:hAnsi="Tahoma"/>
+                <w:b w:val="0"/>
+                <w:sz w:val="18"/>
+              </w:rPr>
+              <w:t>Function calling / JSON output</w:t>
+            </w:r>
+          </w:p>
+        </w:tc>
+        <w:tc>
+          <w:tcPr>
+            <w:tcW w:type="dxa" w:w="3456"/>
+            <w:shd w:val="clear" w:color="auto" w:fill="F2F2F2"/>
+          </w:tcPr>
+          <w:p>
+            <w:pPr>
+              <w:spacing w:before="40" w:after="40"/>
+            </w:pPr>
+            <w:r>
+              <w:rPr>
+                <w:rFonts w:ascii="Tahoma" w:hAnsi="Tahoma"/>
+                <w:b w:val="0"/>
+                <w:sz w:val="18"/>
+              </w:rPr>
+              <w:t>❌ None (FinGPT, Fin-R1, BloombergGPT do not support function calling)</w:t>
+            </w:r>
+          </w:p>
+        </w:tc>
+        <w:tc>
+          <w:tcPr>
+            <w:tcW w:type="dxa" w:w="3456"/>
+            <w:shd w:val="clear" w:color="auto" w:fill="F2F2F2"/>
+          </w:tcPr>
+          <w:p>
+            <w:pPr>
+              <w:spacing w:before="40" w:after="40"/>
+            </w:pPr>
+            <w:r>
+              <w:rPr>
+                <w:rFonts w:ascii="Tahoma" w:hAnsi="Tahoma"/>
+                <w:b w:val="0"/>
+                <w:sz w:val="18"/>
+              </w:rPr>
+              <w:t>✅ Native function calling in Gemini and GPT-5.6; JSON reliable in LLaMA 3.3 70B</w:t>
+            </w:r>
+          </w:p>
+        </w:tc>
+      </w:tr>
+      <w:tr>
+        <w:tc>
+          <w:tcPr>
+            <w:tcW w:type="dxa" w:w="2448"/>
+            <w:shd w:val="clear" w:color="auto" w:fill="FFFFFF"/>
+          </w:tcPr>
+          <w:p>
+            <w:pPr>
+              <w:spacing w:before="40" w:after="40"/>
+            </w:pPr>
+            <w:r>
+              <w:rPr>
+                <w:rFonts w:ascii="Tahoma" w:hAnsi="Tahoma"/>
+                <w:b w:val="0"/>
+                <w:sz w:val="18"/>
+              </w:rPr>
+              <w:t>Free API access for academic use</w:t>
+            </w:r>
+          </w:p>
+        </w:tc>
+        <w:tc>
+          <w:tcPr>
+            <w:tcW w:type="dxa" w:w="3456"/>
+            <w:shd w:val="clear" w:color="auto" w:fill="FFFFFF"/>
+          </w:tcPr>
+          <w:p>
+            <w:pPr>
+              <w:spacing w:before="40" w:after="40"/>
+            </w:pPr>
+            <w:r>
+              <w:rPr>
+                <w:rFonts w:ascii="Tahoma" w:hAnsi="Tahoma"/>
+                <w:b w:val="0"/>
+                <w:sz w:val="18"/>
+              </w:rPr>
+              <w:t>✅ Self-hosted (requires GPU server)</w:t>
+              <w:br/>
+              <w:t>❌ No hosted free API for any finance LLM</w:t>
+            </w:r>
+          </w:p>
+        </w:tc>
+        <w:tc>
+          <w:tcPr>
+            <w:tcW w:type="dxa" w:w="3456"/>
+            <w:shd w:val="clear" w:color="auto" w:fill="FFFFFF"/>
+          </w:tcPr>
+          <w:p>
+            <w:pPr>
+              <w:spacing w:before="40" w:after="40"/>
+            </w:pPr>
+            <w:r>
+              <w:rPr>
+                <w:rFonts w:ascii="Tahoma" w:hAnsi="Tahoma"/>
+                <w:b w:val="0"/>
+                <w:sz w:val="18"/>
+              </w:rPr>
+              <w:t>✅ Gemini Flash-Lite: 1,000/day free</w:t>
+              <w:br/>
+              <w:t>✅ Groq LLaMA 3.3 70B: ~14,400/day free</w:t>
+            </w:r>
+          </w:p>
+        </w:tc>
+      </w:tr>
+      <w:tr>
+        <w:tc>
+          <w:tcPr>
+            <w:tcW w:type="dxa" w:w="2448"/>
+            <w:shd w:val="clear" w:color="auto" w:fill="F2F2F2"/>
+          </w:tcPr>
+          <w:p>
+            <w:pPr>
+              <w:spacing w:before="40" w:after="40"/>
+            </w:pPr>
+            <w:r>
+              <w:rPr>
+                <w:rFonts w:ascii="Tahoma" w:hAnsi="Tahoma"/>
+                <w:b w:val="0"/>
+                <w:sz w:val="18"/>
+              </w:rPr>
+              <w:t>Conversational personal finance</w:t>
+              <w:br/>
+              <w:t>(budgeting, goals, Filipino lifestyle)</w:t>
+            </w:r>
+          </w:p>
+        </w:tc>
+        <w:tc>
+          <w:tcPr>
+            <w:tcW w:type="dxa" w:w="3456"/>
+            <w:shd w:val="clear" w:color="auto" w:fill="F2F2F2"/>
+          </w:tcPr>
+          <w:p>
+            <w:pPr>
+              <w:spacing w:before="40" w:after="40"/>
+            </w:pPr>
+            <w:r>
+              <w:rPr>
+                <w:rFonts w:ascii="Tahoma" w:hAnsi="Tahoma"/>
+                <w:b w:val="0"/>
+                <w:sz w:val="18"/>
+              </w:rPr>
+              <w:t>⚠️ Moderate on structured FinQA</w:t>
+              <w:br/>
+              <w:t>❌ Poor on conversational consumer queries</w:t>
+            </w:r>
+          </w:p>
+        </w:tc>
+        <w:tc>
+          <w:tcPr>
+            <w:tcW w:type="dxa" w:w="3456"/>
+            <w:shd w:val="clear" w:color="auto" w:fill="F2F2F2"/>
+          </w:tcPr>
+          <w:p>
+            <w:pPr>
+              <w:spacing w:before="40" w:after="40"/>
+            </w:pPr>
+            <w:r>
+              <w:rPr>
+                <w:rFonts w:ascii="Tahoma" w:hAnsi="Tahoma"/>
+                <w:b w:val="0"/>
+                <w:sz w:val="18"/>
+              </w:rPr>
+              <w:t>✅ Excellent on conversational advisory — Claude Fable 5, Gemini Pro lead</w:t>
+            </w:r>
+          </w:p>
+        </w:tc>
+      </w:tr>
+      <w:tr>
+        <w:tc>
+          <w:tcPr>
+            <w:tcW w:type="dxa" w:w="2448"/>
+            <w:shd w:val="clear" w:color="auto" w:fill="FFFFFF"/>
+          </w:tcPr>
+          <w:p>
+            <w:pPr>
+              <w:spacing w:before="40" w:after="40"/>
+            </w:pPr>
+            <w:r>
+              <w:rPr>
+                <w:rFonts w:ascii="Tahoma" w:hAnsi="Tahoma"/>
+                <w:b w:val="0"/>
+                <w:sz w:val="18"/>
+              </w:rPr>
+              <w:t>Financial market analysis</w:t>
+              <w:br/>
+              <w:t>(stock valuation, institutional finance)</w:t>
+            </w:r>
+          </w:p>
+        </w:tc>
+        <w:tc>
+          <w:tcPr>
+            <w:tcW w:type="dxa" w:w="3456"/>
+            <w:shd w:val="clear" w:color="auto" w:fill="FFFFFF"/>
+          </w:tcPr>
+          <w:p>
+            <w:pPr>
+              <w:spacing w:before="40" w:after="40"/>
+            </w:pPr>
+            <w:r>
+              <w:rPr>
+                <w:rFonts w:ascii="Tahoma" w:hAnsi="Tahoma"/>
+                <w:b w:val="0"/>
+                <w:sz w:val="18"/>
+              </w:rPr>
+              <w:t>✅ Strong — specifically trained for this</w:t>
+            </w:r>
+          </w:p>
+        </w:tc>
+        <w:tc>
+          <w:tcPr>
+            <w:tcW w:type="dxa" w:w="3456"/>
+            <w:shd w:val="clear" w:color="auto" w:fill="FFFFFF"/>
+          </w:tcPr>
+          <w:p>
+            <w:pPr>
+              <w:spacing w:before="40" w:after="40"/>
+            </w:pPr>
+            <w:r>
+              <w:rPr>
+                <w:rFonts w:ascii="Tahoma" w:hAnsi="Tahoma"/>
+                <w:b w:val="0"/>
+                <w:sz w:val="18"/>
+              </w:rPr>
+              <w:t>⚠️ Adequate for general queries; weaker on specialized institutional tasks</w:t>
+            </w:r>
+          </w:p>
+        </w:tc>
+      </w:tr>
+      <w:tr>
+        <w:tc>
+          <w:tcPr>
+            <w:tcW w:type="dxa" w:w="2448"/>
+            <w:shd w:val="clear" w:color="auto" w:fill="F2F2F2"/>
+          </w:tcPr>
+          <w:p>
+            <w:pPr>
+              <w:spacing w:before="40" w:after="40"/>
+            </w:pPr>
+            <w:r>
+              <w:rPr>
+                <w:rFonts w:ascii="Tahoma" w:hAnsi="Tahoma"/>
+                <w:b w:val="0"/>
+                <w:sz w:val="18"/>
+              </w:rPr>
+              <w:t>Suitable for SmartSpend?</w:t>
+            </w:r>
+          </w:p>
+        </w:tc>
+        <w:tc>
+          <w:tcPr>
+            <w:tcW w:type="dxa" w:w="3456"/>
+            <w:shd w:val="clear" w:color="auto" w:fill="F2F2F2"/>
+          </w:tcPr>
+          <w:p>
+            <w:pPr>
+              <w:spacing w:before="40" w:after="40"/>
+            </w:pPr>
+            <w:r>
+              <w:rPr>
+                <w:rFonts w:ascii="Tahoma" w:hAnsi="Tahoma"/>
+                <w:b w:val="0"/>
+                <w:sz w:val="18"/>
+              </w:rPr>
+              <w:t>❌ Not suitable — wrong domain (market data vs consumer finance), no Filipino support, no hosted API</w:t>
+            </w:r>
+          </w:p>
+        </w:tc>
+        <w:tc>
+          <w:tcPr>
+            <w:tcW w:type="dxa" w:w="3456"/>
+            <w:shd w:val="clear" w:color="auto" w:fill="F2F2F2"/>
+          </w:tcPr>
+          <w:p>
+            <w:pPr>
+              <w:spacing w:before="40" w:after="40"/>
+            </w:pPr>
+            <w:r>
+              <w:rPr>
+                <w:rFonts w:ascii="Tahoma" w:hAnsi="Tahoma"/>
+                <w:b w:val="0"/>
+                <w:sz w:val="18"/>
+              </w:rPr>
+              <w:t>✅ Best choice — multilingual, free tier, reliable JSON, conversational strength</w:t>
+            </w:r>
+          </w:p>
+        </w:tc>
+      </w:tr>
+    </w:tbl>
+    <w:p>
+      <w:pPr>
+        <w:spacing w:before="40" w:after="160"/>
+        <w:jc w:val="center"/>
+      </w:pPr>
+      <w:r>
+        <w:rPr>
+          <w:rFonts w:ascii="Tahoma" w:hAnsi="Tahoma"/>
+          <w:b/>
+          <w:color w:val="222222"/>
+          <w:sz w:val="19"/>
+        </w:rPr>
+        <w:t>Table 3.7. Finance-Specialized vs General LLMs — SmartSpend Suitability Comparison</w:t>
+      </w:r>
+    </w:p>
+    <w:p>
+      <w:pPr>
+        <w:spacing w:before="80" w:after="60"/>
+        <w:jc w:val="both"/>
+      </w:pPr>
+      <w:r>
+        <w:rPr>
+          <w:rFonts w:ascii="Tahoma" w:hAnsi="Tahoma"/>
+          <w:i w:val="0"/>
+          <w:sz w:val="21"/>
+        </w:rPr>
+        <w:t>Core research conclusion (Part 11 of RESEARCH_BASIS.md): A financial application does not require a finance-specialized LLM as its primary language model. Finance-specialized models are optimized for institutional financial NLP tasks (market analysis, sentiment classification, earnings QA) — not for consumer personal finance in Filipino-English. For SmartSpend's workload, modern general-purpose multilingual frontier LLMs are both more capable and more accessible. Source: FrontierFinance Benchmark (Arcila et al., 2026); Li et al. (2024); FinRCA-Bench (Xiao et al., 2026).</w:t>
       </w:r>
     </w:p>
     <w:tbl>
@@ -11967,7 +13688,7 @@
                 <w:color w:val="5C0E24"/>
                 <w:sz w:val="20"/>
               </w:rPr>
-              <w:t>❓ Panel Question:  Why not use GPT-5.6 or Claude Fable 5? They have the best benchmarks.</w:t>
+              <w:t>❓ Panel Question:  Have you considered using Fin-R1 or FinGPT since they're specifically for finance?</w:t>
             </w:r>
           </w:p>
         </w:tc>
@@ -11989,7 +13710,7 @@
                 <w:color w:val="222222"/>
                 <w:sz w:val="20"/>
               </w:rPr>
-              <w:t>✅ Answer:  Both are paid-only with no free tier sufficient for sustained academic use. For 30 respondents at 60 messages/day each (~1,800 daily requests), GPT-5.6 Terra would cost approximately $43.20/day ($1,296/month) at $2/$12 per 1M tokens. Gemini Flash-Lite + Groq's generous free tier covers this at zero cost. The selection rationale prioritizes free-tier availability (15% weight) precisely because this is an academic capstone deployment, not a commercial product.</w:t>
+              <w:t>✅ Answer:  Yes — both were evaluated. Fin-R1 (Liu et al., 2025) achieves SOTA on FinQA and ConvFinQA benchmarks (avg 75.2), which test formal structured financial Q&amp;A. However, it (1) has no hosted API — self-hosting requires a GPU server; (2) has no Filipino-English training; (3) has no function calling support for SmartSpend's 31 agentic actions; and (4) is optimized for institutional financial reasoning, not conversational consumer budgeting. FinGPT is strong on financial classification and sentiment, but the arXiv:2507.08015 evaluation found it significantly weaker than frontier general models on reasoning, QA, and summarization. For SmartSpend's Filipino-English expense parsing and agentic action execution, Gemini 3.1 Flash-Lite outperforms both at zero cost with a hosted API.</w:t>
             </w:r>
           </w:p>
         </w:tc>
@@ -12026,7 +13747,7 @@
                 <w:color w:val="5C0E24"/>
                 <w:sz w:val="20"/>
               </w:rPr>
-              <w:t>❓ Panel Question:  Why use 5 providers instead of just the best one?</w:t>
+              <w:t>❓ Panel Question:  Does using a general LLM mean the AI gives less accurate financial advice?</w:t>
             </w:r>
           </w:p>
         </w:tc>
@@ -12048,7 +13769,66 @@
                 <w:color w:val="222222"/>
                 <w:sz w:val="20"/>
               </w:rPr>
-              <w:t>✅ Answer:  The multi-provider architecture was validated by the FrontierFinance benchmark (2026) finding that tool harness architecture affects performance more than base model choice. Using 5 providers provides: (1) near-zero downtime — if Gemini hits rate limits, Groq takes over automatically; (2) cost optimization — simple queries route to fast/cheap models, complex queries to quality models; (3) Filipino-English backup — Groq LLaMA handles queries when Gemini's daily quota is exhausted; (4) academic completeness — the 5-provider system is a valid contribution to LLM deployment research in itself.</w:t>
+              <w:t>✅ Answer:  No — and this is an important distinction. "Financial accuracy" means different things for different tasks. For institutional tasks (stock valuation, options pricing, SEC filing analysis), finance-specialized LLMs have advantages. For consumer personal finance advisory (budgeting, savings plans, SSS contributions, debt payoff strategy) in Filipino-English, general frontier LLMs are superior because they have broader multilingual training and stronger conversational reasoning. The FrontierFinance Benchmark (2026) confirmed that tool harness architecture — how the LLM receives financial context — affects performance more than whether the model is finance-specialized. SmartSpend's full-context injection architecture (injecting all user financial data before each query) is the key design choice, not the specific model used.</w:t>
+            </w:r>
+          </w:p>
+        </w:tc>
+      </w:tr>
+    </w:tbl>
+    <w:p>
+      <w:pPr>
+        <w:spacing w:after="80"/>
+      </w:pPr>
+    </w:p>
+    <w:tbl>
+      <w:tblPr>
+        <w:tblW w:type="auto" w:w="0"/>
+        <w:jc w:val="center"/>
+        <w:tblLook w:firstColumn="1" w:firstRow="1" w:lastColumn="0" w:lastRow="0" w:noHBand="0" w:noVBand="1" w:val="04A0"/>
+      </w:tblPr>
+      <w:tblGrid>
+        <w:gridCol w:w="9360"/>
+      </w:tblGrid>
+      <w:tr>
+        <w:tc>
+          <w:tcPr>
+            <w:tcW w:type="dxa" w:w="9360"/>
+            <w:shd w:val="clear" w:color="auto" w:fill="EAD9E0"/>
+          </w:tcPr>
+          <w:p>
+            <w:pPr>
+              <w:spacing w:before="60" w:after="60"/>
+            </w:pPr>
+            <w:r>
+              <w:rPr>
+                <w:rFonts w:ascii="Tahoma" w:hAnsi="Tahoma"/>
+                <w:b/>
+                <w:color w:val="5C0E24"/>
+                <w:sz w:val="20"/>
+              </w:rPr>
+              <w:t>❓ Panel Question:  Why not use a hybrid — finance-specialized for calculations, general LLM for conversation?</w:t>
+            </w:r>
+          </w:p>
+        </w:tc>
+      </w:tr>
+      <w:tr>
+        <w:tc>
+          <w:tcPr>
+            <w:tcW w:type="dxa" w:w="9360"/>
+            <w:shd w:val="clear" w:color="auto" w:fill="F9F4F6"/>
+          </w:tcPr>
+          <w:p>
+            <w:pPr>
+              <w:spacing w:before="60" w:after="60"/>
+              <w:ind w:left="216"/>
+            </w:pPr>
+            <w:r>
+              <w:rPr>
+                <w:rFonts w:ascii="Tahoma" w:hAnsi="Tahoma"/>
+                <w:color w:val="222222"/>
+                <w:sz w:val="20"/>
+              </w:rPr>
+              <w:t>✅ Answer:  SmartSpend already implements this hybrid — but the "specialized" layer is application code (score_service.dart), not a finance LLM. Financial calculations (FHS score, savings rate, budget utilization) are always computed deterministically by the Dart financial engine, then handed to the general LLM as pre-calculated context. This is more reliable than any LLM for numerical computation — FinDeepIndicator (2026) and InvestLogicBench (2026) both found that even frontier LLMs exhibit significant numerical degradation on financial arithmetic. Application code is always more accurate for math than any LLM.</w:t>
             </w:r>
           </w:p>
         </w:tc>
@@ -21126,6 +22906,19 @@
           <w:sz w:val="20"/>
         </w:rPr>
         <w:t>Wu, S., et al. (2023). BloombergGPT: A large language model for finance. arXiv:2303.17564. https://arxiv.org/abs/2303.17564</w:t>
+      </w:r>
+    </w:p>
+    <w:p>
+      <w:pPr>
+        <w:spacing w:before="40" w:after="40"/>
+        <w:ind w:left="720" w:hanging="720"/>
+      </w:pPr>
+      <w:r>
+        <w:rPr>
+          <w:rFonts w:ascii="Tahoma" w:hAnsi="Tahoma"/>
+          <w:sz w:val="20"/>
+        </w:rPr>
+        <w:t>Xiao, Z., et al. (2026). FinRCA-Bench: Benchmarking evidence retrieval and reasoning for financial AI systems. arXiv:2608.18534. https://arxiv.org/abs/2608.18534</w:t>
       </w:r>
     </w:p>
     <w:p>

</xml_diff>